<commit_message>
docs(m07): revise workflow critique memo to 5 pain points
- Removed Pain Point 5 (acceptance criteria for grade correctness)
- Renumbered Pain Point 6 → 5
- Updated Executive Summary count from six to five
- Removed OP-05 from summary table
- Updated header: date to 2026-02-23, To field updated
- Regenerated Word export

Co-Authored-By: Claude Sonnet 4.6 <noreply@anthropic.com>
</commit_message>
<xml_diff>
--- a/analysis/workflow-critique-memo.docx
+++ b/analysis/workflow-critique-memo.docx
@@ -19,7 +19,7 @@
         <w:t>To:</w:t>
       </w:r>
       <w:r>
-        <w:t xml:space="preserve"> IT7039 Process Improvement Review</w:t>
+        <w:t xml:space="preserve"> Grading Process Improvement Review</w:t>
       </w:r>
     </w:p>
     <w:p>
@@ -43,7 +43,7 @@
         <w:t>Date:</w:t>
       </w:r>
       <w:r>
-        <w:t xml:space="preserve"> 2026-02-22</w:t>
+        <w:t xml:space="preserve"> 2026-02-23</w:t>
       </w:r>
     </w:p>
     <w:p>
@@ -87,7 +87,7 @@
     </w:p>
     <w:p>
       <w:r>
-        <w:t>The Grade Finalization process (SOP v1.5) is documented, validated, and internally consistent. However, a structured diagnostic review of the SOP, KB article, Quick Reference, and supporting artifacts reveals six recurring pain points. Three of these carry meaningful defect risk — incorrect weights, unsaved changes, and unstructured handoffs — and all six represent opportunities to reduce teacher effort, improve reliability, and close process gaps. This memo documents each issue with its evidence anchor and proposes a practical countermeasure.</w:t>
+        <w:t>The Grade Finalization process (SOP v1.5) is documented, validated, and internally consistent. However, a structured diagnostic review of the SOP, KB article, Quick Reference, and supporting artifacts reveals five recurring pain points. Three of these carry meaningful defect risk — incorrect weights, unsaved changes, and unstructured handoffs — and all six represent opportunities to reduce teacher effort, improve reliability, and close process gaps. This memo documents each issue with its evidence anchor and proposes a practical countermeasure.</w:t>
       </w:r>
     </w:p>
     <w:p>
@@ -382,75 +382,7 @@
         <w:pStyle w:val="Heading3"/>
       </w:pPr>
       <w:r>
-        <w:t>5. No Acceptance Criteria for "Is the Grade Correct?"</w:t>
-      </w:r>
-    </w:p>
-    <w:p>
-      <w:r/>
-      <w:r>
-        <w:rPr>
-          <w:b/>
-        </w:rPr>
-        <w:t>Category:</w:t>
-      </w:r>
-      <w:r>
-        <w:t xml:space="preserve"> Defect / Ambiguity</w:t>
-      </w:r>
-    </w:p>
-    <w:p>
-      <w:r/>
-      <w:r>
-        <w:rPr>
-          <w:b/>
-        </w:rPr>
-        <w:t>SOP reference:</w:t>
-      </w:r>
-      <w:r>
-        <w:t xml:space="preserve"> Step 7 decision</w:t>
-      </w:r>
-    </w:p>
-    <w:p>
-      <w:r>
-        <w:t>The Step 7 decision gate — "Is the final grade correct? Yes → Step 8. No → Step 4" — gives teachers no criteria for what "correct" means. There is no reference value, no minimum threshold, and no comparison to a prior record. The decision is entirely subjective. In a high-stakes context where grade errors cascade to transcripts, this is a meaningful quality gap.</w:t>
-      </w:r>
-    </w:p>
-    <w:p>
-      <w:r/>
-      <w:r>
-        <w:rPr>
-          <w:b/>
-        </w:rPr>
-        <w:t>Evidence:</w:t>
-      </w:r>
-      <w:r>
-        <w:t xml:space="preserve"> SOP Step 7 — decision is binary with no definition of "correct." No acceptance criteria appear anywhere in the SOP, KB article, or Quick Reference.</w:t>
-      </w:r>
-    </w:p>
-    <w:p>
-      <w:r/>
-      <w:r>
-        <w:rPr>
-          <w:b/>
-        </w:rPr>
-        <w:t>Recommendation (OP-05):</w:t>
-      </w:r>
-      <w:r>
-        <w:t xml:space="preserve"> Work with the administrator to define what "correct" means for this decision: e.g., the grade matches the teacher's gradebook, falls within the expected range for the class, or matches a previously communicated expected grade. Document the criteria and add them to Step 7.</w:t>
-      </w:r>
-    </w:p>
-    <w:p>
-      <w:pPr>
-        <w:pBdr>
-          <w:bottom w:val="single" w:sz="6" w:space="1" w:color="AAAAAA"/>
-        </w:pBdr>
-      </w:pPr>
-    </w:p>
-    <w:p>
-      <w:pPr>
-        <w:pStyle w:val="Heading3"/>
-      </w:pPr>
-      <w:r>
-        <w:t>6. Unstructured Email Notification — No Template, No Tracking</w:t>
+        <w:t>5. Unstructured Email Notification — No Template, No Tracking</w:t>
       </w:r>
     </w:p>
     <w:p>
@@ -745,48 +677,6 @@
           <w:p>
             <w:r>
               <w:t>S</w:t>
-            </w:r>
-          </w:p>
-        </w:tc>
-        <w:tc>
-          <w:tcPr>
-            <w:tcW w:type="dxa" w:w="2160"/>
-          </w:tcPr>
-          <w:p>
-            <w:r>
-              <w:t>Medium</w:t>
-            </w:r>
-          </w:p>
-        </w:tc>
-      </w:tr>
-      <w:tr>
-        <w:tc>
-          <w:tcPr>
-            <w:tcW w:type="dxa" w:w="2160"/>
-          </w:tcPr>
-          <w:p>
-            <w:r>
-              <w:t>OP-05</w:t>
-            </w:r>
-          </w:p>
-        </w:tc>
-        <w:tc>
-          <w:tcPr>
-            <w:tcW w:type="dxa" w:w="2160"/>
-          </w:tcPr>
-          <w:p>
-            <w:r>
-              <w:t>Define acceptance criteria for "grade is correct" (Step 7)</w:t>
-            </w:r>
-          </w:p>
-        </w:tc>
-        <w:tc>
-          <w:tcPr>
-            <w:tcW w:type="dxa" w:w="2160"/>
-          </w:tcPr>
-          <w:p>
-            <w:r>
-              <w:t>M</w:t>
             </w:r>
           </w:p>
         </w:tc>

</xml_diff>

<commit_message>
docs(m07): resolve secretary TBD, revise pain points, add OP code explanation
- Secretary role resolved across SOP.md, SOP_v1.md, KB_Page.md, glossary.md,
  process.mmd, process.bpmn, and workflow-critique-memo.md — now tracks which
  teachers have submitted grade finalization confirmation emails
- Workflow critique memo: cut to 5 pain points (removed Pain Point 5),
  updated Pain Points 2, 3, 4 with accurate school schedule context and
  corrected system behavior, added OP code explanation
- M07-plan.md: added OP code explanation before backlog table
- CLAUDE.md: secretary deferred item marked resolved
- Regenerated workflow-critique-memo.docx

Co-Authored-By: Claude Sonnet 4.6 <noreply@anthropic.com>
</commit_message>
<xml_diff>
--- a/analysis/workflow-critique-memo.docx
+++ b/analysis/workflow-critique-memo.docx
@@ -106,6 +106,20 @@
       </w:r>
     </w:p>
     <w:p>
+      <w:r>
+        <w:t xml:space="preserve">Each pain point is assigned an </w:t>
+      </w:r>
+      <w:r>
+        <w:rPr>
+          <w:b/>
+        </w:rPr>
+        <w:t>OP code</w:t>
+      </w:r>
+      <w:r>
+        <w:t xml:space="preserve"> (e.g., OP-01) — a unique identifier for each optimization opportunity. Codes are assigned by priority grouping, not by pain point order, and are used consistently across the critique memo, improvement backlog, and deep-dive analysis to trace each issue through to its recommended countermeasure.</w:t>
+      </w:r>
+    </w:p>
+    <w:p>
       <w:pPr>
         <w:pStyle w:val="Heading3"/>
       </w:pPr>
@@ -207,7 +221,7 @@
     </w:p>
     <w:p>
       <w:r>
-        <w:t>Steps 5, 6, 7, and 8 must be repeated individually for every class the teacher teaches by cycling through a class drop-down menu. With a typical load of five to seven classes, this is twenty to twenty-eight sequential UI interactions with no progress indicator and no record of which classes are done. If a teacher is interrupted or loses their place, there is no system or document safeguard against skipping a class.</w:t>
+        <w:t>Steps 5, 6, 7, and 8 must be repeated individually for every class by cycling through a class drop-down menu. A typical teacher schedule spans nine periods, of which five are unique gradeable classes — two sections of the same course finalize as a single entity, and non-instructional periods (lunch, planning, study hall, academic duty) are excluded. This yields exactly twenty sequential UI interactions per finalization cycle with no progress indicator and no record of which classes are done. If a teacher is interrupted or loses their place, there is no system or document safeguard against skipping a class.</w:t>
       </w:r>
     </w:p>
     <w:p>
@@ -231,7 +245,7 @@
         <w:t>Recommendation (OP-01):</w:t>
       </w:r>
       <w:r>
-        <w:t xml:space="preserve"> Create a one-page class-completion checklist (teacher name, grading period, one row per class with checkbox and completion date). Low effort, immediate risk reduction.</w:t>
+        <w:t xml:space="preserve"> Create a five-row class-completion checklist (teacher name, grading period, one row per gradeable class with checkbox and completion date). Low effort, immediate risk reduction.</w:t>
       </w:r>
     </w:p>
     <w:p>
@@ -275,7 +289,7 @@
     </w:p>
     <w:p>
       <w:r>
-        <w:t>The SOP documents the expected weight configuration as "Quarter exam set to 10%; remaining 90% allocated as percentages or total points" — but this appears only as a prose note with no visual reference. PowerSchool does not enforce these values; any configuration that sums to 100% is accepted. A teacher who inadvertently changes the weights will produce incorrect final grades that may not be caught until the final grade review at Step 7 — or later, after grades are stored.</w:t>
+        <w:t>The only required weight constraint is that the quarter exam is set to 10% of the final grade; the remaining 90% is allocated at the teacher's discretion. However, this requirement appears only as a prose note in the SOP with no visual reference. PowerSchool does not enforce the 10% value — any configuration that sums to 100% is accepted. A teacher who inadvertently changes the exam weight will produce incorrect final grades that may not be caught until the final grade review at Step 7 — or later, after grades are stored.</w:t>
       </w:r>
     </w:p>
     <w:p>
@@ -299,7 +313,7 @@
         <w:t>Recommendation (OP-02):</w:t>
       </w:r>
       <w:r>
-        <w:t xml:space="preserve"> Create a weight reference card (expected values per class type, with a screenshot comparison) and embed it in the SOP and Quick Reference at Step 5. Request administrator review of whether weights can be locked system-side for fixed class types.</w:t>
+        <w:t xml:space="preserve"> Create a grade weight reference card showing the required 10% exam allocation with a screenshot example, and embed it in the SOP and Quick Reference at Step 5. This gives teachers a visual check before saving.</w:t>
       </w:r>
     </w:p>
     <w:p>
@@ -343,7 +357,7 @@
     </w:p>
     <w:p>
       <w:r>
-        <w:t>Saving grade weight changes is its own SOP step (Step 6) because the system does not auto-save and does not warn the user before navigating away. This is a non-obvious system behavior that caused a documentation defect in this project: the "Save before exiting" instruction was missing from the original KB Article and was only caught during cross-artifact validation (CHANGELOG v1.5.1). If this gap appeared in the documentation, it likely also trips up teachers in practice.</w:t>
+        <w:t>PowerSchool does not auto-save grade weight changes but will prompt the user to save when navigating away. The risk is not a missing warning — it is that a teacher may confirm the save prompt without first explicitly verifying that the weights are correct. The system accepts any configuration that sums to 100%, so an unreviewed save can silently commit incorrect weights. This gap was reflected in the project's own documentation: the "Save before exiting" instruction was initially missing from the KB Article and only caught during cross-artifact validation (CHANGELOG v1.5.1).</w:t>
       </w:r>
     </w:p>
     <w:p>
@@ -367,7 +381,7 @@
         <w:t>Recommendation (OP-04):</w:t>
       </w:r>
       <w:r>
-        <w:t xml:space="preserve"> Merge Steps 5 and 6 into a single step that explicitly ends with a save action and an exit criterion confirming the save succeeded. This eliminates the structural gap between verify and save.</w:t>
+        <w:t xml:space="preserve"> Update Step 6 to require explicit verification of grade weights before confirming the save prompt — e.g., "Confirm the quarter exam weight reads 10% before selecting Save." This makes weight review a required gate, not an assumed precondition.</w:t>
       </w:r>
     </w:p>
     <w:p>
@@ -411,7 +425,7 @@
     </w:p>
     <w:p>
       <w:r>
-        <w:t>The process concludes when the teacher "sends an email to the Secretary confirming that all grades are stored in PowerSchool." The SOP provides no email template, no required subject line, no required body content, and no acknowledgment from the secretary. The secretary's follow-up actions are explicitly listed as "[TBD]" in both the SOP and KB article. In practice, the secretary must manually reconcile received emails to determine who has and has not completed grade finalization — a manual tracking task with no system support.</w:t>
+        <w:t>The process concludes when the teacher "sends an email to the Secretary confirming that all grades are stored in PowerSchool." The SOP provides no email template, no required subject line, no required body content, and no acknowledgment from the secretary. The secretary's follow-up responsibility is to track which teachers have submitted grade finalization confirmation emails for the grading period. However, the SOP provides no email template, no required subject line, and no required body content, leaving the secretary to manually reconcile unstructured emails with no system support.</w:t>
       </w:r>
     </w:p>
     <w:p>
@@ -423,7 +437,7 @@
         <w:t>Evidence:</w:t>
       </w:r>
       <w:r>
-        <w:t xml:space="preserve"> SOP Step 10 — "Send an email to the Secretary." No template. Secretary role — "[TBD: Follow-up actions after notification]" in SOP `roles` and KB_Page Roles table.</w:t>
+        <w:t xml:space="preserve"> SOP Step 10 — "Send an email to the Secretary." No template. Secretary role — tracks teacher completion, but with no defined email format to support consistent tracking.</w:t>
       </w:r>
     </w:p>
     <w:p>

</xml_diff>